<commit_message>
last updarte before end
</commit_message>
<xml_diff>
--- a/Ramapo620-50_syllabus1.1docx.docx
+++ b/Ramapo620-50_syllabus1.1docx.docx
@@ -79,6 +79,7 @@
         </w:rPr>
         <w:t xml:space="preserve">0 - </w:t>
       </w:r>
+      <w:proofErr w:type="gramStart"/>
       <w:r>
         <w:rPr>
           <w:rFonts w:ascii="Arial" w:hAnsi="Arial" w:cs="Arial"/>
@@ -95,7 +96,17 @@
           <w:sz w:val="24"/>
           <w:szCs w:val="24"/>
         </w:rPr>
-        <w:t xml:space="preserve">0 : </w:t>
+        <w:t>0 :</w:t>
+      </w:r>
+      <w:proofErr w:type="gramEnd"/>
+      <w:r>
+        <w:rPr>
+          <w:rFonts w:ascii="Arial" w:hAnsi="Arial" w:cs="Arial"/>
+          <w:color w:val="000000" w:themeColor="text1"/>
+          <w:sz w:val="24"/>
+          <w:szCs w:val="24"/>
+        </w:rPr>
+        <w:t xml:space="preserve"> </w:t>
       </w:r>
       <w:r>
         <w:rPr>
@@ -313,7 +324,29 @@
           <w:sz w:val="24"/>
           <w:szCs w:val="24"/>
         </w:rPr>
-        <w:t>Class Github:</w:t>
+        <w:t xml:space="preserve">Class </w:t>
+      </w:r>
+      <w:proofErr w:type="spellStart"/>
+      <w:r>
+        <w:rPr>
+          <w:rFonts w:ascii="Arial" w:hAnsi="Arial" w:cs="Arial"/>
+          <w:b/>
+          <w:bCs/>
+          <w:sz w:val="24"/>
+          <w:szCs w:val="24"/>
+        </w:rPr>
+        <w:t>Github</w:t>
+      </w:r>
+      <w:proofErr w:type="spellEnd"/>
+      <w:r>
+        <w:rPr>
+          <w:rFonts w:ascii="Arial" w:hAnsi="Arial" w:cs="Arial"/>
+          <w:b/>
+          <w:bCs/>
+          <w:sz w:val="24"/>
+          <w:szCs w:val="24"/>
+        </w:rPr>
+        <w:t>:</w:t>
       </w:r>
     </w:p>
     <w:p>
@@ -442,7 +475,27 @@
           <w:sz w:val="24"/>
           <w:szCs w:val="24"/>
         </w:rPr>
-        <w:t xml:space="preserve">This course provides a foundational introduction to music programming languages. SuperCollider, </w:t>
+        <w:t xml:space="preserve">This course provides a foundational introduction to music programming languages. </w:t>
+      </w:r>
+      <w:proofErr w:type="spellStart"/>
+      <w:r>
+        <w:rPr>
+          <w:rFonts w:ascii="Arial" w:eastAsia="Times New Roman" w:hAnsi="Arial" w:cs="Arial"/>
+          <w:color w:val="000000" w:themeColor="text1"/>
+          <w:sz w:val="24"/>
+          <w:szCs w:val="24"/>
+        </w:rPr>
+        <w:t>SuperCollider</w:t>
+      </w:r>
+      <w:proofErr w:type="spellEnd"/>
+      <w:r>
+        <w:rPr>
+          <w:rFonts w:ascii="Arial" w:eastAsia="Times New Roman" w:hAnsi="Arial" w:cs="Arial"/>
+          <w:color w:val="000000" w:themeColor="text1"/>
+          <w:sz w:val="24"/>
+          <w:szCs w:val="24"/>
+        </w:rPr>
+        <w:t xml:space="preserve">, </w:t>
       </w:r>
       <w:r>
         <w:rPr>
@@ -1349,6 +1402,7 @@
           <w:szCs w:val="24"/>
         </w:rPr>
       </w:pPr>
+      <w:proofErr w:type="spellStart"/>
       <w:r>
         <w:rPr>
           <w:rFonts w:ascii="Arial" w:eastAsia="Times New Roman" w:hAnsi="Arial" w:cs="Arial"/>
@@ -1358,7 +1412,19 @@
           <w:sz w:val="24"/>
           <w:szCs w:val="24"/>
         </w:rPr>
-        <w:t>collection:"Tutorials/Max Tutorials@cycling74"</w:t>
+        <w:t>collection:"Tutorials</w:t>
+      </w:r>
+      <w:proofErr w:type="spellEnd"/>
+      <w:r>
+        <w:rPr>
+          <w:rFonts w:ascii="Arial" w:eastAsia="Times New Roman" w:hAnsi="Arial" w:cs="Arial"/>
+          <w:b/>
+          <w:iCs/>
+          <w:color w:val="000000"/>
+          <w:sz w:val="24"/>
+          <w:szCs w:val="24"/>
+        </w:rPr>
+        <w:t>/Max Tutorials@cycling74"</w:t>
       </w:r>
     </w:p>
     <w:p>
@@ -1373,6 +1439,7 @@
           <w:szCs w:val="24"/>
         </w:rPr>
       </w:pPr>
+      <w:proofErr w:type="spellStart"/>
       <w:r>
         <w:rPr>
           <w:rFonts w:ascii="Arial" w:eastAsia="Times New Roman" w:hAnsi="Arial" w:cs="Arial"/>
@@ -1382,7 +1449,19 @@
           <w:sz w:val="24"/>
           <w:szCs w:val="24"/>
         </w:rPr>
-        <w:t>collection:"Tutorials/MSP Tutorials@cycling74"</w:t>
+        <w:t>collection:"Tutorials</w:t>
+      </w:r>
+      <w:proofErr w:type="spellEnd"/>
+      <w:r>
+        <w:rPr>
+          <w:rFonts w:ascii="Arial" w:eastAsia="Times New Roman" w:hAnsi="Arial" w:cs="Arial"/>
+          <w:b/>
+          <w:iCs/>
+          <w:color w:val="000000"/>
+          <w:sz w:val="24"/>
+          <w:szCs w:val="24"/>
+        </w:rPr>
+        <w:t>/MSP Tutorials@cycling74"</w:t>
       </w:r>
     </w:p>
     <w:p>
@@ -1687,7 +1766,27 @@
           <w:sz w:val="24"/>
           <w:szCs w:val="24"/>
         </w:rPr>
-        <w:t>Extremely powerful code based platform</w:t>
+        <w:t xml:space="preserve">Extremely powerful </w:t>
+      </w:r>
+      <w:proofErr w:type="gramStart"/>
+      <w:r>
+        <w:rPr>
+          <w:rFonts w:ascii="Arial" w:eastAsia="Times New Roman" w:hAnsi="Arial" w:cs="Arial"/>
+          <w:color w:val="000000" w:themeColor="text1"/>
+          <w:sz w:val="24"/>
+          <w:szCs w:val="24"/>
+        </w:rPr>
+        <w:t>code based</w:t>
+      </w:r>
+      <w:proofErr w:type="gramEnd"/>
+      <w:r>
+        <w:rPr>
+          <w:rFonts w:ascii="Arial" w:eastAsia="Times New Roman" w:hAnsi="Arial" w:cs="Arial"/>
+          <w:color w:val="000000" w:themeColor="text1"/>
+          <w:sz w:val="24"/>
+          <w:szCs w:val="24"/>
+        </w:rPr>
+        <w:t xml:space="preserve"> platform</w:t>
       </w:r>
     </w:p>
     <w:p>
@@ -1737,6 +1836,7 @@
           <w:szCs w:val="24"/>
         </w:rPr>
       </w:pPr>
+      <w:proofErr w:type="spellStart"/>
       <w:r>
         <w:rPr>
           <w:rFonts w:ascii="Arial" w:eastAsia="Times New Roman" w:hAnsi="Arial" w:cs="Arial"/>
@@ -1748,6 +1848,7 @@
         </w:rPr>
         <w:t>Csound</w:t>
       </w:r>
+      <w:proofErr w:type="spellEnd"/>
     </w:p>
     <w:p>
       <w:pPr>
@@ -1965,8 +2066,19 @@
           <w:sz w:val="24"/>
           <w:szCs w:val="24"/>
         </w:rPr>
-        <w:t>Daisy ElectroSmith</w:t>
-      </w:r>
+        <w:t xml:space="preserve">Daisy </w:t>
+      </w:r>
+      <w:proofErr w:type="spellStart"/>
+      <w:r>
+        <w:rPr>
+          <w:rFonts w:ascii="Arial" w:eastAsia="Times New Roman" w:hAnsi="Arial" w:cs="Arial"/>
+          <w:color w:val="000000" w:themeColor="text1"/>
+          <w:sz w:val="24"/>
+          <w:szCs w:val="24"/>
+        </w:rPr>
+        <w:t>ElectroSmith</w:t>
+      </w:r>
+      <w:proofErr w:type="spellEnd"/>
     </w:p>
     <w:p>
       <w:pPr>
@@ -2180,7 +2292,27 @@
           <w:szCs w:val="24"/>
         </w:rPr>
         <w:tab/>
-        <w:t>Flying Fish PCB (DFishkin)</w:t>
+        <w:t>Flying Fish PCB (</w:t>
+      </w:r>
+      <w:proofErr w:type="spellStart"/>
+      <w:r>
+        <w:rPr>
+          <w:rFonts w:ascii="Arial" w:eastAsia="Times New Roman" w:hAnsi="Arial" w:cs="Arial"/>
+          <w:color w:val="000000" w:themeColor="text1"/>
+          <w:sz w:val="24"/>
+          <w:szCs w:val="24"/>
+        </w:rPr>
+        <w:t>DFishkin</w:t>
+      </w:r>
+      <w:proofErr w:type="spellEnd"/>
+      <w:r>
+        <w:rPr>
+          <w:rFonts w:ascii="Arial" w:eastAsia="Times New Roman" w:hAnsi="Arial" w:cs="Arial"/>
+          <w:color w:val="000000" w:themeColor="text1"/>
+          <w:sz w:val="24"/>
+          <w:szCs w:val="24"/>
+        </w:rPr>
+        <w:t>)</w:t>
       </w:r>
     </w:p>
     <w:p>
@@ -2309,11 +2441,32 @@
           <w:sz w:val="24"/>
           <w:szCs w:val="24"/>
         </w:rPr>
-        <w:t xml:space="preserve">Since this is a coding class, we use Git for version tracking. I am constanting updating, refining, refactoring, and revising code bases throughout the semester and many times throughout the week. Please learn to use </w:t>
-      </w:r>
+        <w:t xml:space="preserve">Since this is a coding class, we use Git for version tracking. I am </w:t>
+      </w:r>
+      <w:proofErr w:type="spellStart"/>
       <w:r>
         <w:rPr>
           <w:rFonts w:ascii="Arial" w:eastAsia="Times New Roman" w:hAnsi="Arial" w:cs="Arial"/>
+          <w:color w:val="000000" w:themeColor="text1"/>
+          <w:sz w:val="24"/>
+          <w:szCs w:val="24"/>
+        </w:rPr>
+        <w:t>constanting</w:t>
+      </w:r>
+      <w:proofErr w:type="spellEnd"/>
+      <w:r>
+        <w:rPr>
+          <w:rFonts w:ascii="Arial" w:eastAsia="Times New Roman" w:hAnsi="Arial" w:cs="Arial"/>
+          <w:color w:val="000000" w:themeColor="text1"/>
+          <w:sz w:val="24"/>
+          <w:szCs w:val="24"/>
+        </w:rPr>
+        <w:t xml:space="preserve"> updating, refining, refactoring, and revising code bases throughout the semester and many times throughout the week. Please learn to use </w:t>
+      </w:r>
+      <w:proofErr w:type="spellStart"/>
+      <w:r>
+        <w:rPr>
+          <w:rFonts w:ascii="Arial" w:eastAsia="Times New Roman" w:hAnsi="Arial" w:cs="Arial"/>
           <w:b/>
           <w:bCs/>
           <w:color w:val="000000" w:themeColor="text1"/>
@@ -2322,6 +2475,7 @@
         </w:rPr>
         <w:t>Github</w:t>
       </w:r>
+      <w:proofErr w:type="spellEnd"/>
       <w:r>
         <w:rPr>
           <w:rFonts w:ascii="Arial" w:eastAsia="Times New Roman" w:hAnsi="Arial" w:cs="Arial"/>
@@ -2340,7 +2494,27 @@
           <w:sz w:val="24"/>
           <w:szCs w:val="24"/>
         </w:rPr>
-        <w:t>Download Github Desktop and make an account asap.</w:t>
+        <w:t xml:space="preserve">Download </w:t>
+      </w:r>
+      <w:proofErr w:type="spellStart"/>
+      <w:r>
+        <w:rPr>
+          <w:rFonts w:ascii="Arial" w:eastAsia="Times New Roman" w:hAnsi="Arial" w:cs="Arial"/>
+          <w:color w:val="000000" w:themeColor="text1"/>
+          <w:sz w:val="24"/>
+          <w:szCs w:val="24"/>
+        </w:rPr>
+        <w:t>Github</w:t>
+      </w:r>
+      <w:proofErr w:type="spellEnd"/>
+      <w:r>
+        <w:rPr>
+          <w:rFonts w:ascii="Arial" w:eastAsia="Times New Roman" w:hAnsi="Arial" w:cs="Arial"/>
+          <w:color w:val="000000" w:themeColor="text1"/>
+          <w:sz w:val="24"/>
+          <w:szCs w:val="24"/>
+        </w:rPr>
+        <w:t xml:space="preserve"> Desktop and make an account asap.</w:t>
       </w:r>
     </w:p>
     <w:p>
@@ -2747,7 +2921,25 @@
           <w:sz w:val="24"/>
           <w:szCs w:val="24"/>
         </w:rPr>
-        <w:t>Demonstrate the ability to create programs in SuperCollider, Python, Processing and C++ in the production of compositions an</w:t>
+        <w:t xml:space="preserve">Demonstrate the ability to create programs in </w:t>
+      </w:r>
+      <w:proofErr w:type="spellStart"/>
+      <w:r>
+        <w:rPr>
+          <w:rFonts w:ascii="Arial" w:hAnsi="Arial" w:cs="Arial"/>
+          <w:sz w:val="24"/>
+          <w:szCs w:val="24"/>
+        </w:rPr>
+        <w:t>SuperCollider</w:t>
+      </w:r>
+      <w:proofErr w:type="spellEnd"/>
+      <w:r>
+        <w:rPr>
+          <w:rFonts w:ascii="Arial" w:hAnsi="Arial" w:cs="Arial"/>
+          <w:sz w:val="24"/>
+          <w:szCs w:val="24"/>
+        </w:rPr>
+        <w:t>, Python, Processing and C++ in the production of compositions an</w:t>
       </w:r>
       <w:r>
         <w:rPr>
@@ -2788,7 +2980,25 @@
           <w:sz w:val="24"/>
           <w:szCs w:val="24"/>
         </w:rPr>
-        <w:t>Understand the fundamentals of computer programming languages for music and be able to implement them to build original Audio Unit &amp; VSTplugins (Projects)</w:t>
+        <w:t xml:space="preserve">Understand the fundamentals of computer programming languages for music and be able to implement them to build original Audio Unit &amp; </w:t>
+      </w:r>
+      <w:proofErr w:type="spellStart"/>
+      <w:r>
+        <w:rPr>
+          <w:rFonts w:ascii="Arial" w:hAnsi="Arial" w:cs="Arial"/>
+          <w:sz w:val="24"/>
+          <w:szCs w:val="24"/>
+        </w:rPr>
+        <w:t>VSTplugins</w:t>
+      </w:r>
+      <w:proofErr w:type="spellEnd"/>
+      <w:r>
+        <w:rPr>
+          <w:rFonts w:ascii="Arial" w:hAnsi="Arial" w:cs="Arial"/>
+          <w:sz w:val="24"/>
+          <w:szCs w:val="24"/>
+        </w:rPr>
+        <w:t xml:space="preserve"> (Projects)</w:t>
       </w:r>
     </w:p>
     <w:p>
@@ -3492,8 +3702,18 @@
           <w:sz w:val="24"/>
           <w:szCs w:val="24"/>
         </w:rPr>
-        <w:t>catch up!—</w:t>
-      </w:r>
+        <w:t xml:space="preserve">catch </w:t>
+      </w:r>
+      <w:proofErr w:type="gramStart"/>
+      <w:r>
+        <w:rPr>
+          <w:color w:val="000000" w:themeColor="text1"/>
+          <w:sz w:val="24"/>
+          <w:szCs w:val="24"/>
+        </w:rPr>
+        <w:t>up!—</w:t>
+      </w:r>
+      <w:proofErr w:type="gramEnd"/>
       <w:r>
         <w:rPr>
           <w:color w:val="000000" w:themeColor="text1"/>
@@ -3650,7 +3870,25 @@
           <w:sz w:val="24"/>
           <w:szCs w:val="24"/>
         </w:rPr>
-        <w:t>, or an instrumet,</w:t>
+        <w:t xml:space="preserve">, or an </w:t>
+      </w:r>
+      <w:proofErr w:type="spellStart"/>
+      <w:r>
+        <w:rPr>
+          <w:color w:val="000000" w:themeColor="text1"/>
+          <w:sz w:val="24"/>
+          <w:szCs w:val="24"/>
+        </w:rPr>
+        <w:t>instrumet</w:t>
+      </w:r>
+      <w:proofErr w:type="spellEnd"/>
+      <w:r>
+        <w:rPr>
+          <w:color w:val="000000" w:themeColor="text1"/>
+          <w:sz w:val="24"/>
+          <w:szCs w:val="24"/>
+        </w:rPr>
+        <w:t>,</w:t>
       </w:r>
       <w:r>
         <w:rPr>
@@ -3747,7 +3985,25 @@
           <w:sz w:val="24"/>
           <w:szCs w:val="24"/>
         </w:rPr>
-        <w:t>It should be appropriately cited, referenced. You should not just link to Youtube videos and let the video do the talking.</w:t>
+        <w:t xml:space="preserve">It should be appropriately cited, referenced. You should not just link to </w:t>
+      </w:r>
+      <w:proofErr w:type="spellStart"/>
+      <w:r>
+        <w:rPr>
+          <w:color w:val="000000" w:themeColor="text1"/>
+          <w:sz w:val="24"/>
+          <w:szCs w:val="24"/>
+        </w:rPr>
+        <w:t>Youtube</w:t>
+      </w:r>
+      <w:proofErr w:type="spellEnd"/>
+      <w:r>
+        <w:rPr>
+          <w:color w:val="000000" w:themeColor="text1"/>
+          <w:sz w:val="24"/>
+          <w:szCs w:val="24"/>
+        </w:rPr>
+        <w:t xml:space="preserve"> videos and let the video do the talking.</w:t>
       </w:r>
     </w:p>
     <w:p>
@@ -4131,7 +4387,43 @@
           <w:sz w:val="24"/>
           <w:szCs w:val="24"/>
         </w:rPr>
-        <w:t xml:space="preserve">The use of Machine Learning tools such as ChatGPT and Claude are permitted, generally. In some cases we will explore them deliberately. In some instances you will be discouraged from using these tools. AI represents a sea change for humanity. It also represents a paradigm shift for pedagogy in digital literacy.  </w:t>
+        <w:t xml:space="preserve">The use of Machine Learning tools such as ChatGPT and Claude are permitted, generally. In some </w:t>
+      </w:r>
+      <w:proofErr w:type="gramStart"/>
+      <w:r>
+        <w:rPr>
+          <w:rFonts w:ascii="Arial" w:hAnsi="Arial" w:cs="Arial"/>
+          <w:sz w:val="24"/>
+          <w:szCs w:val="24"/>
+        </w:rPr>
+        <w:t>cases</w:t>
+      </w:r>
+      <w:proofErr w:type="gramEnd"/>
+      <w:r>
+        <w:rPr>
+          <w:rFonts w:ascii="Arial" w:hAnsi="Arial" w:cs="Arial"/>
+          <w:sz w:val="24"/>
+          <w:szCs w:val="24"/>
+        </w:rPr>
+        <w:t xml:space="preserve"> we will explore them deliberately. In some </w:t>
+      </w:r>
+      <w:proofErr w:type="gramStart"/>
+      <w:r>
+        <w:rPr>
+          <w:rFonts w:ascii="Arial" w:hAnsi="Arial" w:cs="Arial"/>
+          <w:sz w:val="24"/>
+          <w:szCs w:val="24"/>
+        </w:rPr>
+        <w:t>instances</w:t>
+      </w:r>
+      <w:proofErr w:type="gramEnd"/>
+      <w:r>
+        <w:rPr>
+          <w:rFonts w:ascii="Arial" w:hAnsi="Arial" w:cs="Arial"/>
+          <w:sz w:val="24"/>
+          <w:szCs w:val="24"/>
+        </w:rPr>
+        <w:t xml:space="preserve"> you will be discouraged from using these tools. AI represents a sea change for humanity. It also represents a paradigm shift for pedagogy in digital literacy.  </w:t>
       </w:r>
     </w:p>
     <w:p>
@@ -4396,7 +4688,27 @@
           <w:sz w:val="24"/>
           <w:szCs w:val="24"/>
         </w:rPr>
-        <w:t xml:space="preserve">As a faculty member, I am also required by our College to report incidents of sexual misconduct and thus cannot guarantee confidentiality, but I will respect your privacy and only share the information with those who have a duty to respond. Should I become aware of an incident involving sexual misconduct, I must provide our Title IX Coordinator with relevant details such as the names of those involved in the incident. </w:t>
+        <w:t xml:space="preserve">As a faculty member, I am also required by our </w:t>
+      </w:r>
+      <w:proofErr w:type="gramStart"/>
+      <w:r>
+        <w:rPr>
+          <w:rFonts w:ascii="Arial" w:hAnsi="Arial" w:cs="Arial"/>
+          <w:color w:val="141414"/>
+          <w:sz w:val="24"/>
+          <w:szCs w:val="24"/>
+        </w:rPr>
+        <w:t>College</w:t>
+      </w:r>
+      <w:proofErr w:type="gramEnd"/>
+      <w:r>
+        <w:rPr>
+          <w:rFonts w:ascii="Arial" w:hAnsi="Arial" w:cs="Arial"/>
+          <w:color w:val="141414"/>
+          <w:sz w:val="24"/>
+          <w:szCs w:val="24"/>
+        </w:rPr>
+        <w:t xml:space="preserve"> to report incidents of sexual misconduct and thus cannot guarantee confidentiality, but I will respect your privacy and only share the information with those who have a duty to respond. Should I become aware of an incident involving sexual misconduct, I must provide our Title IX Coordinator with relevant details such as the names of those involved in the incident. </w:t>
       </w:r>
     </w:p>
     <w:p>
@@ -4578,7 +4890,25 @@
           <w:b/>
           <w:bCs/>
         </w:rPr>
-        <w:t xml:space="preserve">Introduction to the SuperCollider 3 </w:t>
+        <w:t xml:space="preserve">Introduction to the </w:t>
+      </w:r>
+      <w:proofErr w:type="spellStart"/>
+      <w:r>
+        <w:rPr>
+          <w:rFonts w:ascii="Arial" w:hAnsi="Arial" w:cs="Arial"/>
+          <w:b/>
+          <w:bCs/>
+        </w:rPr>
+        <w:t>SuperCollider</w:t>
+      </w:r>
+      <w:proofErr w:type="spellEnd"/>
+      <w:r>
+        <w:rPr>
+          <w:rFonts w:ascii="Arial" w:hAnsi="Arial" w:cs="Arial"/>
+          <w:b/>
+          <w:bCs/>
+        </w:rPr>
+        <w:t xml:space="preserve"> 3 </w:t>
       </w:r>
       <w:r>
         <w:rPr>
@@ -4998,6 +5328,7 @@
         </w:rPr>
         <w:t xml:space="preserve">ubmit it on </w:t>
       </w:r>
+      <w:proofErr w:type="spellStart"/>
       <w:r>
         <w:rPr>
           <w:rFonts w:ascii="Arial" w:hAnsi="Arial" w:cs="Arial"/>
@@ -5006,6 +5337,7 @@
         </w:rPr>
         <w:t>github</w:t>
       </w:r>
+      <w:proofErr w:type="spellEnd"/>
       <w:r>
         <w:rPr>
           <w:rFonts w:ascii="Arial" w:hAnsi="Arial" w:cs="Arial"/>
@@ -5070,7 +5402,43 @@
           <w:sz w:val="24"/>
           <w:szCs w:val="24"/>
         </w:rPr>
-        <w:t xml:space="preserve">Live Coding in SuperCollider: a Tutorial with Eli Fieldsteel </w:t>
+        <w:t xml:space="preserve">Live Coding in </w:t>
+      </w:r>
+      <w:proofErr w:type="spellStart"/>
+      <w:r>
+        <w:rPr>
+          <w:color w:val="000000" w:themeColor="text1"/>
+          <w:sz w:val="24"/>
+          <w:szCs w:val="24"/>
+        </w:rPr>
+        <w:t>SuperCollider</w:t>
+      </w:r>
+      <w:proofErr w:type="spellEnd"/>
+      <w:r>
+        <w:rPr>
+          <w:color w:val="000000" w:themeColor="text1"/>
+          <w:sz w:val="24"/>
+          <w:szCs w:val="24"/>
+        </w:rPr>
+        <w:t xml:space="preserve">: a Tutorial with Eli </w:t>
+      </w:r>
+      <w:proofErr w:type="spellStart"/>
+      <w:r>
+        <w:rPr>
+          <w:color w:val="000000" w:themeColor="text1"/>
+          <w:sz w:val="24"/>
+          <w:szCs w:val="24"/>
+        </w:rPr>
+        <w:t>Fieldsteel</w:t>
+      </w:r>
+      <w:proofErr w:type="spellEnd"/>
+      <w:r>
+        <w:rPr>
+          <w:color w:val="000000" w:themeColor="text1"/>
+          <w:sz w:val="24"/>
+          <w:szCs w:val="24"/>
+        </w:rPr>
+        <w:t xml:space="preserve"> </w:t>
       </w:r>
       <w:hyperlink r:id="rId24" w:history="1">
         <w:r>
@@ -5247,34 +5615,65 @@
         </w:rPr>
         <w:t xml:space="preserve">Learning </w:t>
       </w:r>
-      <w:r>
-        <w:rPr>
-          <w:iCs/>
-          <w:color w:val="000000" w:themeColor="text1"/>
-          <w:sz w:val="24"/>
-          <w:szCs w:val="24"/>
-        </w:rPr>
-        <w:t>NodeProxy—The simplest and most direct way to recycle and utilize code in instruments, live, in Supercollider.</w:t>
-      </w:r>
-    </w:p>
-    <w:p>
-      <w:pPr>
-        <w:pStyle w:val="Normal1"/>
-        <w:rPr>
-          <w:iCs/>
-          <w:color w:val="000000" w:themeColor="text1"/>
-          <w:sz w:val="24"/>
-          <w:szCs w:val="24"/>
-        </w:rPr>
-      </w:pPr>
-      <w:r>
-        <w:rPr>
-          <w:iCs/>
-          <w:color w:val="000000" w:themeColor="text1"/>
-          <w:sz w:val="24"/>
-          <w:szCs w:val="24"/>
-        </w:rPr>
-        <w:t>Learning Synthdef—the standard way to program synths for global programming concepts in SC</w:t>
+      <w:proofErr w:type="spellStart"/>
+      <w:r>
+        <w:rPr>
+          <w:iCs/>
+          <w:color w:val="000000" w:themeColor="text1"/>
+          <w:sz w:val="24"/>
+          <w:szCs w:val="24"/>
+        </w:rPr>
+        <w:t>NodeProxy</w:t>
+      </w:r>
+      <w:proofErr w:type="spellEnd"/>
+      <w:r>
+        <w:rPr>
+          <w:iCs/>
+          <w:color w:val="000000" w:themeColor="text1"/>
+          <w:sz w:val="24"/>
+          <w:szCs w:val="24"/>
+        </w:rPr>
+        <w:t>—The simplest and most direct way to recycle and utilize code in instruments, live, in Supercollider.</w:t>
+      </w:r>
+    </w:p>
+    <w:p>
+      <w:pPr>
+        <w:pStyle w:val="Normal1"/>
+        <w:rPr>
+          <w:iCs/>
+          <w:color w:val="000000" w:themeColor="text1"/>
+          <w:sz w:val="24"/>
+          <w:szCs w:val="24"/>
+        </w:rPr>
+      </w:pPr>
+      <w:r>
+        <w:rPr>
+          <w:iCs/>
+          <w:color w:val="000000" w:themeColor="text1"/>
+          <w:sz w:val="24"/>
+          <w:szCs w:val="24"/>
+        </w:rPr>
+        <w:t xml:space="preserve">Learning </w:t>
+      </w:r>
+      <w:proofErr w:type="spellStart"/>
+      <w:r>
+        <w:rPr>
+          <w:iCs/>
+          <w:color w:val="000000" w:themeColor="text1"/>
+          <w:sz w:val="24"/>
+          <w:szCs w:val="24"/>
+        </w:rPr>
+        <w:t>Synthdef</w:t>
+      </w:r>
+      <w:proofErr w:type="spellEnd"/>
+      <w:r>
+        <w:rPr>
+          <w:iCs/>
+          <w:color w:val="000000" w:themeColor="text1"/>
+          <w:sz w:val="24"/>
+          <w:szCs w:val="24"/>
+        </w:rPr>
+        <w:t>—the standard way to program synths for global programming concepts in SC</w:t>
       </w:r>
     </w:p>
     <w:p>
@@ -5371,17 +5770,39 @@
           <w:sz w:val="24"/>
           <w:szCs w:val="24"/>
         </w:rPr>
-        <w:t>Prepare 3 synthesis tools in Supercollider that work with NodeProxy</w:t>
-      </w:r>
-      <w:r>
-        <w:rPr>
-          <w:iCs/>
-          <w:color w:val="000000" w:themeColor="text1"/>
-          <w:sz w:val="24"/>
-          <w:szCs w:val="24"/>
-        </w:rPr>
-        <w:t xml:space="preserve"> OR synthdef</w:t>
-      </w:r>
+        <w:t xml:space="preserve">Prepare 3 synthesis tools in Supercollider that work with </w:t>
+      </w:r>
+      <w:proofErr w:type="spellStart"/>
+      <w:r>
+        <w:rPr>
+          <w:iCs/>
+          <w:color w:val="000000" w:themeColor="text1"/>
+          <w:sz w:val="24"/>
+          <w:szCs w:val="24"/>
+        </w:rPr>
+        <w:t>NodeProxy</w:t>
+      </w:r>
+      <w:proofErr w:type="spellEnd"/>
+      <w:r>
+        <w:rPr>
+          <w:iCs/>
+          <w:color w:val="000000" w:themeColor="text1"/>
+          <w:sz w:val="24"/>
+          <w:szCs w:val="24"/>
+        </w:rPr>
+        <w:t xml:space="preserve"> OR </w:t>
+      </w:r>
+      <w:proofErr w:type="spellStart"/>
+      <w:r>
+        <w:rPr>
+          <w:iCs/>
+          <w:color w:val="000000" w:themeColor="text1"/>
+          <w:sz w:val="24"/>
+          <w:szCs w:val="24"/>
+        </w:rPr>
+        <w:t>synthdef</w:t>
+      </w:r>
+      <w:proofErr w:type="spellEnd"/>
       <w:r>
         <w:rPr>
           <w:iCs/>
@@ -5425,8 +5846,19 @@
           <w:sz w:val="24"/>
           <w:szCs w:val="24"/>
         </w:rPr>
-        <w:t xml:space="preserve"> gui</w:t>
-      </w:r>
+        <w:t xml:space="preserve"> </w:t>
+      </w:r>
+      <w:proofErr w:type="spellStart"/>
+      <w:r>
+        <w:rPr>
+          <w:iCs/>
+          <w:color w:val="000000" w:themeColor="text1"/>
+          <w:sz w:val="24"/>
+          <w:szCs w:val="24"/>
+        </w:rPr>
+        <w:t>gui</w:t>
+      </w:r>
+      <w:proofErr w:type="spellEnd"/>
       <w:r>
         <w:rPr>
           <w:iCs/>
@@ -5666,8 +6098,21 @@
           <w:sz w:val="24"/>
           <w:szCs w:val="24"/>
         </w:rPr>
-        <w:t>Introduction to Max Msp</w:t>
-      </w:r>
+        <w:t xml:space="preserve">Introduction to Max </w:t>
+      </w:r>
+      <w:proofErr w:type="spellStart"/>
+      <w:r>
+        <w:rPr>
+          <w:b/>
+          <w:bCs/>
+          <w:iCs/>
+          <w:color w:val="000000" w:themeColor="text1"/>
+          <w:sz w:val="24"/>
+          <w:szCs w:val="24"/>
+        </w:rPr>
+        <w:t>Msp</w:t>
+      </w:r>
+      <w:proofErr w:type="spellEnd"/>
     </w:p>
     <w:p>
       <w:pPr>
@@ -5831,7 +6276,23 @@
           <w:sz w:val="24"/>
           <w:szCs w:val="24"/>
         </w:rPr>
-        <w:t xml:space="preserve">David Behrman is a composer and artist active since the 1960s. Over the years he has made sound and multimedia installations for gallery spaces as well as musical compositions for performance in concerts. Most of his pieces feature flexible structures and the use of technology in personal ways; compositions rely on interactive real-time relationships with imaginative performers. Together with Robert Ashley, Alvin Lucier and Gordon Mumma, Behrman founded the Sonic Arts Union in 1966. He had a long association with the Merce Cunningham Dance Company as composer and performer, created music for several of the Company’s repertory pieces, and was a member of the Company’s Music Committee during its last years. He was a fellow at the American Academy in Berlin in 2016. Audio recordings of his works are on the XI, Lovely Music, Pogus, New World, WERGO, Black Truffle Records and Alga Marghen labels. </w:t>
+        <w:t xml:space="preserve">David Behrman is a composer and artist active since the 1960s. Over the years he has made sound and multimedia installations for gallery spaces as well as musical compositions for performance in concerts. Most of his pieces feature flexible structures and the use of technology in personal ways; compositions rely on interactive real-time relationships with imaginative performers. Together with Robert Ashley, Alvin Lucier and Gordon Mumma, Behrman founded the Sonic Arts Union in 1966. He had a long association with the Merce Cunningham Dance Company as composer and performer, created music for several of the Company’s repertory pieces, and was a member of the Company’s Music Committee during its last years. He was a fellow at the American Academy in Berlin in 2016. Audio recordings of his works are on the XI, Lovely Music, Pogus, New World, WERGO, Black Truffle Records and Alga </w:t>
+      </w:r>
+      <w:proofErr w:type="spellStart"/>
+      <w:r>
+        <w:rPr>
+          <w:sz w:val="24"/>
+          <w:szCs w:val="24"/>
+        </w:rPr>
+        <w:t>Marghen</w:t>
+      </w:r>
+      <w:proofErr w:type="spellEnd"/>
+      <w:r>
+        <w:rPr>
+          <w:sz w:val="24"/>
+          <w:szCs w:val="24"/>
+        </w:rPr>
+        <w:t xml:space="preserve"> labels. </w:t>
       </w:r>
       <w:r>
         <w:rPr>
@@ -5908,7 +6369,27 @@
           <w:sz w:val="24"/>
           <w:szCs w:val="24"/>
         </w:rPr>
-        <w:t>and Leapday Night</w:t>
+        <w:t xml:space="preserve">and </w:t>
+      </w:r>
+      <w:proofErr w:type="spellStart"/>
+      <w:r>
+        <w:rPr>
+          <w:iCs/>
+          <w:color w:val="000000" w:themeColor="text1"/>
+          <w:sz w:val="24"/>
+          <w:szCs w:val="24"/>
+        </w:rPr>
+        <w:t>Leapday</w:t>
+      </w:r>
+      <w:proofErr w:type="spellEnd"/>
+      <w:r>
+        <w:rPr>
+          <w:iCs/>
+          <w:color w:val="000000" w:themeColor="text1"/>
+          <w:sz w:val="24"/>
+          <w:szCs w:val="24"/>
+        </w:rPr>
+        <w:t xml:space="preserve"> Night</w:t>
       </w:r>
     </w:p>
     <w:p>
@@ -6440,7 +6921,29 @@
           <w:sz w:val="24"/>
           <w:szCs w:val="24"/>
         </w:rPr>
-        <w:t>No HW, but if you’re behind schedule office hours. Or write an NodeProxy instrument from Floating Point Errors or Crows with arguments that can be controlled.</w:t>
+        <w:t xml:space="preserve">No HW, but if you’re behind schedule office hours. Or write an </w:t>
+      </w:r>
+      <w:proofErr w:type="spellStart"/>
+      <w:r>
+        <w:rPr>
+          <w:rFonts w:ascii="Arial" w:hAnsi="Arial" w:cs="Arial"/>
+          <w:iCs/>
+          <w:color w:val="000000" w:themeColor="text1"/>
+          <w:sz w:val="24"/>
+          <w:szCs w:val="24"/>
+        </w:rPr>
+        <w:t>NodeProxy</w:t>
+      </w:r>
+      <w:proofErr w:type="spellEnd"/>
+      <w:r>
+        <w:rPr>
+          <w:rFonts w:ascii="Arial" w:hAnsi="Arial" w:cs="Arial"/>
+          <w:iCs/>
+          <w:color w:val="000000" w:themeColor="text1"/>
+          <w:sz w:val="24"/>
+          <w:szCs w:val="24"/>
+        </w:rPr>
+        <w:t xml:space="preserve"> instrument from Floating Point Errors or Crows with arguments that can be controlled.</w:t>
       </w:r>
     </w:p>
     <w:p>
@@ -6615,6 +7118,7 @@
         </w:rPr>
         <w:t xml:space="preserve">, as part of Celebrating David Behrman—a Fall series honoring the groundbreaking composer and 2025 ISSUE Gala honoree—ISSUE Project Room presents an evening of performances that illuminate Behrman’s enduring legacy of collaboration, technological innovation, and influence across generations of experimental music. The program features two works: </w:t>
       </w:r>
+      <w:proofErr w:type="spellStart"/>
       <w:r>
         <w:rPr>
           <w:rStyle w:val="Emphasis"/>
@@ -6623,6 +7127,7 @@
         </w:rPr>
         <w:t>Runthrough</w:t>
       </w:r>
+      <w:proofErr w:type="spellEnd"/>
       <w:r>
         <w:rPr>
           <w:sz w:val="24"/>
@@ -6889,14 +7394,470 @@
           <w:szCs w:val="24"/>
         </w:rPr>
       </w:pPr>
-      <w:r>
-        <w:rPr>
-          <w:iCs/>
-          <w:color w:val="000000" w:themeColor="text1"/>
-          <w:sz w:val="24"/>
-          <w:szCs w:val="24"/>
-        </w:rPr>
-        <w:t>bytebeat composer</w:t>
+      <w:proofErr w:type="spellStart"/>
+      <w:r>
+        <w:rPr>
+          <w:iCs/>
+          <w:color w:val="000000" w:themeColor="text1"/>
+          <w:sz w:val="24"/>
+          <w:szCs w:val="24"/>
+        </w:rPr>
+        <w:t>bytebeat</w:t>
+      </w:r>
+      <w:proofErr w:type="spellEnd"/>
+      <w:r>
+        <w:rPr>
+          <w:iCs/>
+          <w:color w:val="000000" w:themeColor="text1"/>
+          <w:sz w:val="24"/>
+          <w:szCs w:val="24"/>
+        </w:rPr>
+        <w:t xml:space="preserve"> composer</w:t>
+      </w:r>
+    </w:p>
+    <w:p>
+      <w:pPr>
+        <w:pStyle w:val="Normal1"/>
+        <w:rPr>
+          <w:iCs/>
+          <w:color w:val="000000" w:themeColor="text1"/>
+          <w:sz w:val="24"/>
+          <w:szCs w:val="24"/>
+        </w:rPr>
+      </w:pPr>
+    </w:p>
+    <w:p>
+      <w:pPr>
+        <w:pStyle w:val="Normal1"/>
+        <w:rPr>
+          <w:b/>
+          <w:bCs/>
+          <w:iCs/>
+          <w:color w:val="000000" w:themeColor="text1"/>
+          <w:sz w:val="24"/>
+          <w:szCs w:val="24"/>
+        </w:rPr>
+      </w:pPr>
+      <w:r>
+        <w:rPr>
+          <w:b/>
+          <w:bCs/>
+          <w:iCs/>
+          <w:color w:val="000000" w:themeColor="text1"/>
+          <w:sz w:val="24"/>
+          <w:szCs w:val="24"/>
+        </w:rPr>
+        <w:t>Terry Riley in C</w:t>
+      </w:r>
+    </w:p>
+    <w:p>
+      <w:pPr>
+        <w:pStyle w:val="Normal1"/>
+        <w:rPr>
+          <w:iCs/>
+          <w:color w:val="000000" w:themeColor="text1"/>
+          <w:sz w:val="24"/>
+          <w:szCs w:val="24"/>
+        </w:rPr>
+      </w:pPr>
+      <w:r>
+        <w:rPr>
+          <w:iCs/>
+          <w:color w:val="000000" w:themeColor="text1"/>
+          <w:sz w:val="24"/>
+          <w:szCs w:val="24"/>
+        </w:rPr>
+        <w:t>1)</w:t>
+      </w:r>
+    </w:p>
+    <w:p>
+      <w:pPr>
+        <w:pStyle w:val="Normal1"/>
+        <w:rPr>
+          <w:iCs/>
+          <w:color w:val="000000" w:themeColor="text1"/>
+          <w:sz w:val="24"/>
+          <w:szCs w:val="24"/>
+          <w:u w:val="single"/>
+        </w:rPr>
+      </w:pPr>
+      <w:r>
+        <w:rPr>
+          <w:iCs/>
+          <w:color w:val="000000" w:themeColor="text1"/>
+          <w:sz w:val="24"/>
+          <w:szCs w:val="24"/>
+          <w:u w:val="single"/>
+        </w:rPr>
+        <w:t xml:space="preserve">Transcribe these measures into supercollider code for </w:t>
+      </w:r>
+      <w:proofErr w:type="gramStart"/>
+      <w:r>
+        <w:rPr>
+          <w:iCs/>
+          <w:color w:val="000000" w:themeColor="text1"/>
+          <w:sz w:val="24"/>
+          <w:szCs w:val="24"/>
+          <w:u w:val="single"/>
+        </w:rPr>
+        <w:t>In</w:t>
+      </w:r>
+      <w:proofErr w:type="gramEnd"/>
+      <w:r>
+        <w:rPr>
+          <w:iCs/>
+          <w:color w:val="000000" w:themeColor="text1"/>
+          <w:sz w:val="24"/>
+          <w:szCs w:val="24"/>
+          <w:u w:val="single"/>
+        </w:rPr>
+        <w:t xml:space="preserve"> C, make sure you follow the exact format.</w:t>
+      </w:r>
+    </w:p>
+    <w:p>
+      <w:pPr>
+        <w:pStyle w:val="Normal1"/>
+        <w:rPr>
+          <w:iCs/>
+          <w:color w:val="000000" w:themeColor="text1"/>
+          <w:sz w:val="24"/>
+          <w:szCs w:val="24"/>
+        </w:rPr>
+      </w:pPr>
+      <w:hyperlink r:id="rId29" w:history="1">
+        <w:r>
+          <w:rPr>
+            <w:rStyle w:val="Hyperlink"/>
+            <w:iCs/>
+            <w:sz w:val="24"/>
+            <w:szCs w:val="24"/>
+          </w:rPr>
+          <w:t>https://teropa.info/blog/2017/01/23/terry-rileys-in-c.html</w:t>
+        </w:r>
+      </w:hyperlink>
+    </w:p>
+    <w:p>
+      <w:pPr>
+        <w:pStyle w:val="Normal1"/>
+        <w:rPr>
+          <w:iCs/>
+          <w:color w:val="000000" w:themeColor="text1"/>
+          <w:sz w:val="24"/>
+          <w:szCs w:val="24"/>
+        </w:rPr>
+      </w:pPr>
+      <w:r>
+        <w:rPr>
+          <w:iCs/>
+          <w:color w:val="000000" w:themeColor="text1"/>
+          <w:sz w:val="24"/>
+          <w:szCs w:val="24"/>
+        </w:rPr>
+        <w:t xml:space="preserve">use this to check your work and WRITE ME before Wednesday if you are stuck. </w:t>
+      </w:r>
+    </w:p>
+    <w:p>
+      <w:pPr>
+        <w:pStyle w:val="Normal1"/>
+        <w:rPr>
+          <w:iCs/>
+          <w:color w:val="000000" w:themeColor="text1"/>
+          <w:sz w:val="24"/>
+          <w:szCs w:val="24"/>
+        </w:rPr>
+      </w:pPr>
+    </w:p>
+    <w:p>
+      <w:pPr>
+        <w:pStyle w:val="Normal1"/>
+        <w:rPr>
+          <w:iCs/>
+          <w:color w:val="000000" w:themeColor="text1"/>
+          <w:sz w:val="24"/>
+          <w:szCs w:val="24"/>
+        </w:rPr>
+      </w:pPr>
+      <w:r>
+        <w:rPr>
+          <w:iCs/>
+          <w:color w:val="000000" w:themeColor="text1"/>
+          <w:sz w:val="24"/>
+          <w:szCs w:val="24"/>
+        </w:rPr>
+        <w:t>Logan — 26-34</w:t>
+      </w:r>
+    </w:p>
+    <w:p>
+      <w:pPr>
+        <w:pStyle w:val="Normal1"/>
+        <w:rPr>
+          <w:iCs/>
+          <w:color w:val="000000" w:themeColor="text1"/>
+          <w:sz w:val="24"/>
+          <w:szCs w:val="24"/>
+        </w:rPr>
+      </w:pPr>
+      <w:r>
+        <w:rPr>
+          <w:iCs/>
+          <w:color w:val="000000" w:themeColor="text1"/>
+          <w:sz w:val="24"/>
+          <w:szCs w:val="24"/>
+        </w:rPr>
+        <w:t>L</w:t>
+      </w:r>
+      <w:r>
+        <w:rPr>
+          <w:iCs/>
+          <w:color w:val="000000" w:themeColor="text1"/>
+          <w:sz w:val="24"/>
+          <w:szCs w:val="24"/>
+        </w:rPr>
+        <w:t>achlan</w:t>
+      </w:r>
+      <w:r>
+        <w:rPr>
+          <w:iCs/>
+          <w:color w:val="000000" w:themeColor="text1"/>
+          <w:sz w:val="24"/>
+          <w:szCs w:val="24"/>
+        </w:rPr>
+        <w:t xml:space="preserve"> 35-40</w:t>
+      </w:r>
+    </w:p>
+    <w:p>
+      <w:pPr>
+        <w:pStyle w:val="Normal1"/>
+        <w:rPr>
+          <w:iCs/>
+          <w:color w:val="000000" w:themeColor="text1"/>
+          <w:sz w:val="24"/>
+          <w:szCs w:val="24"/>
+        </w:rPr>
+      </w:pPr>
+      <w:r>
+        <w:rPr>
+          <w:iCs/>
+          <w:color w:val="000000" w:themeColor="text1"/>
+          <w:sz w:val="24"/>
+          <w:szCs w:val="24"/>
+        </w:rPr>
+        <w:t>Fred</w:t>
+      </w:r>
+      <w:r>
+        <w:rPr>
+          <w:iCs/>
+          <w:color w:val="000000" w:themeColor="text1"/>
+          <w:sz w:val="24"/>
+          <w:szCs w:val="24"/>
+        </w:rPr>
+        <w:t xml:space="preserve"> — 41-46</w:t>
+      </w:r>
+    </w:p>
+    <w:p>
+      <w:pPr>
+        <w:pStyle w:val="Normal1"/>
+        <w:rPr>
+          <w:iCs/>
+          <w:color w:val="000000" w:themeColor="text1"/>
+          <w:sz w:val="24"/>
+          <w:szCs w:val="24"/>
+        </w:rPr>
+      </w:pPr>
+      <w:r>
+        <w:rPr>
+          <w:iCs/>
+          <w:color w:val="000000" w:themeColor="text1"/>
+          <w:sz w:val="24"/>
+          <w:szCs w:val="24"/>
+        </w:rPr>
+        <w:t>Joh</w:t>
+      </w:r>
+      <w:r>
+        <w:rPr>
+          <w:iCs/>
+          <w:color w:val="000000" w:themeColor="text1"/>
+          <w:sz w:val="24"/>
+          <w:szCs w:val="24"/>
+        </w:rPr>
+        <w:t>n —47-53</w:t>
+      </w:r>
+    </w:p>
+    <w:p>
+      <w:pPr>
+        <w:pStyle w:val="Normal1"/>
+        <w:rPr>
+          <w:iCs/>
+          <w:color w:val="000000" w:themeColor="text1"/>
+          <w:sz w:val="24"/>
+          <w:szCs w:val="24"/>
+        </w:rPr>
+      </w:pPr>
+    </w:p>
+    <w:p>
+      <w:pPr>
+        <w:pStyle w:val="Normal1"/>
+        <w:rPr>
+          <w:iCs/>
+          <w:color w:val="000000" w:themeColor="text1"/>
+          <w:sz w:val="24"/>
+          <w:szCs w:val="24"/>
+        </w:rPr>
+      </w:pPr>
+      <w:r>
+        <w:rPr>
+          <w:iCs/>
+          <w:color w:val="000000" w:themeColor="text1"/>
+          <w:sz w:val="24"/>
+          <w:szCs w:val="24"/>
+        </w:rPr>
+        <w:t xml:space="preserve">Due Tuesday by email to Prof. </w:t>
+      </w:r>
+    </w:p>
+    <w:p>
+      <w:pPr>
+        <w:pStyle w:val="Normal1"/>
+        <w:rPr>
+          <w:iCs/>
+          <w:color w:val="000000" w:themeColor="text1"/>
+          <w:sz w:val="24"/>
+          <w:szCs w:val="24"/>
+        </w:rPr>
+      </w:pPr>
+    </w:p>
+    <w:p>
+      <w:pPr>
+        <w:pStyle w:val="Normal1"/>
+        <w:rPr>
+          <w:iCs/>
+          <w:color w:val="000000" w:themeColor="text1"/>
+          <w:sz w:val="24"/>
+          <w:szCs w:val="24"/>
+        </w:rPr>
+      </w:pPr>
+      <w:r>
+        <w:rPr>
+          <w:iCs/>
+          <w:color w:val="000000" w:themeColor="text1"/>
+          <w:sz w:val="24"/>
+          <w:szCs w:val="24"/>
+        </w:rPr>
+        <w:t>2)</w:t>
+      </w:r>
+    </w:p>
+    <w:p>
+      <w:pPr>
+        <w:pStyle w:val="Normal1"/>
+        <w:rPr>
+          <w:iCs/>
+          <w:color w:val="000000" w:themeColor="text1"/>
+          <w:sz w:val="24"/>
+          <w:szCs w:val="24"/>
+          <w:u w:val="single"/>
+        </w:rPr>
+      </w:pPr>
+      <w:r>
+        <w:rPr>
+          <w:iCs/>
+          <w:color w:val="000000" w:themeColor="text1"/>
+          <w:sz w:val="24"/>
+          <w:szCs w:val="24"/>
+          <w:u w:val="single"/>
+        </w:rPr>
+        <w:t>Design some sounds for playing this piece of music!</w:t>
+      </w:r>
+    </w:p>
+    <w:p>
+      <w:pPr>
+        <w:pStyle w:val="Normal1"/>
+        <w:rPr>
+          <w:iCs/>
+          <w:color w:val="000000" w:themeColor="text1"/>
+          <w:sz w:val="24"/>
+          <w:szCs w:val="24"/>
+        </w:rPr>
+      </w:pPr>
+      <w:proofErr w:type="spellStart"/>
+      <w:proofErr w:type="gramStart"/>
+      <w:r>
+        <w:rPr>
+          <w:iCs/>
+          <w:color w:val="000000" w:themeColor="text1"/>
+          <w:sz w:val="24"/>
+          <w:szCs w:val="24"/>
+        </w:rPr>
+        <w:t>Its</w:t>
+      </w:r>
+      <w:proofErr w:type="spellEnd"/>
+      <w:proofErr w:type="gramEnd"/>
+      <w:r>
+        <w:rPr>
+          <w:iCs/>
+          <w:color w:val="000000" w:themeColor="text1"/>
+          <w:sz w:val="24"/>
+          <w:szCs w:val="24"/>
+        </w:rPr>
+        <w:t xml:space="preserve"> up to you. You can use stuff from </w:t>
+      </w:r>
+      <w:proofErr w:type="spellStart"/>
+      <w:r>
+        <w:rPr>
+          <w:iCs/>
+          <w:color w:val="000000" w:themeColor="text1"/>
+          <w:sz w:val="24"/>
+          <w:szCs w:val="24"/>
+        </w:rPr>
+        <w:t>thre</w:t>
+      </w:r>
+      <w:proofErr w:type="spellEnd"/>
+      <w:r>
+        <w:rPr>
+          <w:iCs/>
+          <w:color w:val="000000" w:themeColor="text1"/>
+          <w:sz w:val="24"/>
+          <w:szCs w:val="24"/>
+        </w:rPr>
+        <w:t xml:space="preserve"> SCLORK </w:t>
+      </w:r>
+      <w:proofErr w:type="spellStart"/>
+      <w:r>
+        <w:rPr>
+          <w:iCs/>
+          <w:color w:val="000000" w:themeColor="text1"/>
+          <w:sz w:val="24"/>
+          <w:szCs w:val="24"/>
+        </w:rPr>
+        <w:t>respository</w:t>
+      </w:r>
+      <w:proofErr w:type="spellEnd"/>
+      <w:r>
+        <w:rPr>
+          <w:iCs/>
+          <w:color w:val="000000" w:themeColor="text1"/>
+          <w:sz w:val="24"/>
+          <w:szCs w:val="24"/>
+        </w:rPr>
+        <w:t xml:space="preserve"> and you can design your own </w:t>
+      </w:r>
+      <w:proofErr w:type="spellStart"/>
+      <w:r>
+        <w:rPr>
+          <w:iCs/>
+          <w:color w:val="000000" w:themeColor="text1"/>
+          <w:sz w:val="24"/>
+          <w:szCs w:val="24"/>
+        </w:rPr>
+        <w:t>synthdefs</w:t>
+      </w:r>
+      <w:proofErr w:type="spellEnd"/>
+      <w:r>
+        <w:rPr>
+          <w:iCs/>
+          <w:color w:val="000000" w:themeColor="text1"/>
+          <w:sz w:val="24"/>
+          <w:szCs w:val="24"/>
+        </w:rPr>
+        <w:t>. And you can hack on effects like filters and reverbs.</w:t>
       </w:r>
     </w:p>
     <w:p>
@@ -7028,12 +7989,10 @@
           <w:sz w:val="24"/>
           <w:szCs w:val="24"/>
         </w:rPr>
-        <w:t>Introduction to Playbuf</w:t>
-      </w:r>
-    </w:p>
-    <w:p>
-      <w:pPr>
-        <w:pStyle w:val="Normal1"/>
+        <w:t xml:space="preserve">Introduction to </w:t>
+      </w:r>
+      <w:proofErr w:type="spellStart"/>
+      <w:r>
         <w:rPr>
           <w:b/>
           <w:bCs/>
@@ -7042,8 +8001,13 @@
           <w:sz w:val="24"/>
           <w:szCs w:val="24"/>
         </w:rPr>
-      </w:pPr>
-      <w:r>
+        <w:t>Playbuf</w:t>
+      </w:r>
+      <w:proofErr w:type="spellEnd"/>
+    </w:p>
+    <w:p>
+      <w:pPr>
+        <w:pStyle w:val="Normal1"/>
         <w:rPr>
           <w:b/>
           <w:bCs/>
@@ -7052,6 +8016,16 @@
           <w:sz w:val="24"/>
           <w:szCs w:val="24"/>
         </w:rPr>
+      </w:pPr>
+      <w:r>
+        <w:rPr>
+          <w:b/>
+          <w:bCs/>
+          <w:iCs/>
+          <w:color w:val="000000" w:themeColor="text1"/>
+          <w:sz w:val="24"/>
+          <w:szCs w:val="24"/>
+        </w:rPr>
         <w:t>Introduction to Granular Synthesis</w:t>
       </w:r>
     </w:p>
@@ -7067,6 +8041,7 @@
           <w:szCs w:val="24"/>
         </w:rPr>
       </w:pPr>
+      <w:proofErr w:type="spellStart"/>
       <w:r>
         <w:rPr>
           <w:b/>
@@ -7076,8 +8051,33 @@
           <w:sz w:val="24"/>
           <w:szCs w:val="24"/>
         </w:rPr>
-        <w:t>Introduciton to 2d.wave</w:t>
-      </w:r>
+        <w:t>Introduciton</w:t>
+      </w:r>
+      <w:proofErr w:type="spellEnd"/>
+      <w:r>
+        <w:rPr>
+          <w:b/>
+          <w:bCs/>
+          <w:iCs/>
+          <w:color w:val="000000" w:themeColor="text1"/>
+          <w:sz w:val="24"/>
+          <w:szCs w:val="24"/>
+        </w:rPr>
+        <w:t xml:space="preserve"> to 2</w:t>
+      </w:r>
+      <w:proofErr w:type="gramStart"/>
+      <w:r>
+        <w:rPr>
+          <w:b/>
+          <w:bCs/>
+          <w:iCs/>
+          <w:color w:val="000000" w:themeColor="text1"/>
+          <w:sz w:val="24"/>
+          <w:szCs w:val="24"/>
+        </w:rPr>
+        <w:t>d.wave</w:t>
+      </w:r>
+      <w:proofErr w:type="gramEnd"/>
     </w:p>
     <w:p>
       <w:pPr>
@@ -7164,7 +8164,128 @@
           <w:sz w:val="24"/>
           <w:szCs w:val="24"/>
         </w:rPr>
-        <w:t>Incorporate a sampler into your favorite Synthdef or Nodeproxy tools thus far. Remove synthesis engine and replace it with Playbuf, BufRd, or Grainbuf. You can “vibecode.” The point is to get it to work somehow.</w:t>
+        <w:lastRenderedPageBreak/>
+        <w:t xml:space="preserve">Incorporate a sampler into your favorite </w:t>
+      </w:r>
+      <w:proofErr w:type="spellStart"/>
+      <w:r>
+        <w:rPr>
+          <w:iCs/>
+          <w:color w:val="000000" w:themeColor="text1"/>
+          <w:sz w:val="24"/>
+          <w:szCs w:val="24"/>
+        </w:rPr>
+        <w:t>Synthdef</w:t>
+      </w:r>
+      <w:proofErr w:type="spellEnd"/>
+      <w:r>
+        <w:rPr>
+          <w:iCs/>
+          <w:color w:val="000000" w:themeColor="text1"/>
+          <w:sz w:val="24"/>
+          <w:szCs w:val="24"/>
+        </w:rPr>
+        <w:t xml:space="preserve"> or </w:t>
+      </w:r>
+      <w:proofErr w:type="spellStart"/>
+      <w:r>
+        <w:rPr>
+          <w:iCs/>
+          <w:color w:val="000000" w:themeColor="text1"/>
+          <w:sz w:val="24"/>
+          <w:szCs w:val="24"/>
+        </w:rPr>
+        <w:t>Nodeproxy</w:t>
+      </w:r>
+      <w:proofErr w:type="spellEnd"/>
+      <w:r>
+        <w:rPr>
+          <w:iCs/>
+          <w:color w:val="000000" w:themeColor="text1"/>
+          <w:sz w:val="24"/>
+          <w:szCs w:val="24"/>
+        </w:rPr>
+        <w:t xml:space="preserve"> tools thus far. Remove synthesis engine and replace it with </w:t>
+      </w:r>
+      <w:proofErr w:type="spellStart"/>
+      <w:r>
+        <w:rPr>
+          <w:iCs/>
+          <w:color w:val="000000" w:themeColor="text1"/>
+          <w:sz w:val="24"/>
+          <w:szCs w:val="24"/>
+        </w:rPr>
+        <w:t>Playbuf</w:t>
+      </w:r>
+      <w:proofErr w:type="spellEnd"/>
+      <w:r>
+        <w:rPr>
+          <w:iCs/>
+          <w:color w:val="000000" w:themeColor="text1"/>
+          <w:sz w:val="24"/>
+          <w:szCs w:val="24"/>
+        </w:rPr>
+        <w:t xml:space="preserve">, </w:t>
+      </w:r>
+      <w:proofErr w:type="spellStart"/>
+      <w:r>
+        <w:rPr>
+          <w:iCs/>
+          <w:color w:val="000000" w:themeColor="text1"/>
+          <w:sz w:val="24"/>
+          <w:szCs w:val="24"/>
+        </w:rPr>
+        <w:t>BufRd</w:t>
+      </w:r>
+      <w:proofErr w:type="spellEnd"/>
+      <w:r>
+        <w:rPr>
+          <w:iCs/>
+          <w:color w:val="000000" w:themeColor="text1"/>
+          <w:sz w:val="24"/>
+          <w:szCs w:val="24"/>
+        </w:rPr>
+        <w:t xml:space="preserve">, or </w:t>
+      </w:r>
+      <w:proofErr w:type="spellStart"/>
+      <w:r>
+        <w:rPr>
+          <w:iCs/>
+          <w:color w:val="000000" w:themeColor="text1"/>
+          <w:sz w:val="24"/>
+          <w:szCs w:val="24"/>
+        </w:rPr>
+        <w:t>Grainbuf</w:t>
+      </w:r>
+      <w:proofErr w:type="spellEnd"/>
+      <w:r>
+        <w:rPr>
+          <w:iCs/>
+          <w:color w:val="000000" w:themeColor="text1"/>
+          <w:sz w:val="24"/>
+          <w:szCs w:val="24"/>
+        </w:rPr>
+        <w:t>. You can “</w:t>
+      </w:r>
+      <w:proofErr w:type="spellStart"/>
+      <w:r>
+        <w:rPr>
+          <w:iCs/>
+          <w:color w:val="000000" w:themeColor="text1"/>
+          <w:sz w:val="24"/>
+          <w:szCs w:val="24"/>
+        </w:rPr>
+        <w:t>vibecode</w:t>
+      </w:r>
+      <w:proofErr w:type="spellEnd"/>
+      <w:r>
+        <w:rPr>
+          <w:iCs/>
+          <w:color w:val="000000" w:themeColor="text1"/>
+          <w:sz w:val="24"/>
+          <w:szCs w:val="24"/>
+        </w:rPr>
+        <w:t>.” The point is to get it to work somehow.</w:t>
       </w:r>
     </w:p>
     <w:p>
@@ -7263,7 +8384,7 @@
           <w:szCs w:val="24"/>
         </w:rPr>
       </w:pPr>
-      <w:hyperlink r:id="rId29" w:history="1">
+      <w:hyperlink r:id="rId30" w:history="1">
         <w:r>
           <w:rPr>
             <w:rStyle w:val="Hyperlink"/>
@@ -7322,7 +8443,6 @@
           <w:sz w:val="24"/>
           <w:szCs w:val="24"/>
         </w:rPr>
-        <w:lastRenderedPageBreak/>
         <w:drawing>
           <wp:inline distT="0" distB="0" distL="0" distR="0" wp14:anchorId="78099015" wp14:editId="21E970F7">
             <wp:extent cx="4415453" cy="3237998"/>
@@ -7339,7 +8459,7 @@
                     <pic:cNvPicPr/>
                   </pic:nvPicPr>
                   <pic:blipFill>
-                    <a:blip r:embed="rId30"/>
+                    <a:blip r:embed="rId31"/>
                     <a:stretch>
                       <a:fillRect/>
                     </a:stretch>
@@ -7427,7 +8547,27 @@
           <w:sz w:val="24"/>
           <w:szCs w:val="24"/>
         </w:rPr>
-        <w:t>Make sure you finish your working flying fish instrument. Request office hours time with Professor if needed.</w:t>
+        <w:t xml:space="preserve">Make sure you finish your working flying fish instrument. Request office </w:t>
+      </w:r>
+      <w:proofErr w:type="spellStart"/>
+      <w:r>
+        <w:rPr>
+          <w:iCs/>
+          <w:color w:val="000000" w:themeColor="text1"/>
+          <w:sz w:val="24"/>
+          <w:szCs w:val="24"/>
+        </w:rPr>
+        <w:t>hours time</w:t>
+      </w:r>
+      <w:proofErr w:type="spellEnd"/>
+      <w:r>
+        <w:rPr>
+          <w:iCs/>
+          <w:color w:val="000000" w:themeColor="text1"/>
+          <w:sz w:val="24"/>
+          <w:szCs w:val="24"/>
+        </w:rPr>
+        <w:t xml:space="preserve"> with Professor if needed.</w:t>
       </w:r>
       <w:r>
         <w:rPr>
@@ -7671,7 +8811,7 @@
           <w:szCs w:val="24"/>
         </w:rPr>
       </w:pPr>
-      <w:hyperlink r:id="rId31" w:history="1">
+      <w:hyperlink r:id="rId32" w:history="1">
         <w:r>
           <w:rPr>
             <w:rStyle w:val="Hyperlink"/>
@@ -7735,7 +8875,27 @@
           <w:sz w:val="24"/>
           <w:szCs w:val="24"/>
         </w:rPr>
-        <w:t>Upload and change your own code to flying fish sampler sketch. But first you need to prepare your sample, first by saving a 0.5 second wav file as an 8 bit raw file, and then using the python script to encode your own digital array from that small sample. It needs to be 0.5 seconds, otherwise it will crash.</w:t>
+        <w:t xml:space="preserve">Upload and change your own code to flying fish sampler sketch. But first you need to prepare your sample, first by saving a 0.5 second wav file as an </w:t>
+      </w:r>
+      <w:proofErr w:type="gramStart"/>
+      <w:r>
+        <w:rPr>
+          <w:iCs/>
+          <w:color w:val="000000" w:themeColor="text1"/>
+          <w:sz w:val="24"/>
+          <w:szCs w:val="24"/>
+        </w:rPr>
+        <w:t>8 bit</w:t>
+      </w:r>
+      <w:proofErr w:type="gramEnd"/>
+      <w:r>
+        <w:rPr>
+          <w:iCs/>
+          <w:color w:val="000000" w:themeColor="text1"/>
+          <w:sz w:val="24"/>
+          <w:szCs w:val="24"/>
+        </w:rPr>
+        <w:t xml:space="preserve"> raw file, and then using the python script to encode your own digital array from that small sample. It needs to be 0.5 seconds, otherwise it will crash.</w:t>
       </w:r>
     </w:p>
     <w:p>
@@ -7759,7 +8919,6 @@
           <w:sz w:val="24"/>
           <w:szCs w:val="24"/>
         </w:rPr>
-        <w:lastRenderedPageBreak/>
         <w:t>or use one of the other DSP examples to make whatever sounds you’d like for the instrument. Add a new sketch and make it your own.</w:t>
       </w:r>
     </w:p>
@@ -7937,20 +9096,31 @@
           <w:sz w:val="24"/>
           <w:szCs w:val="24"/>
         </w:rPr>
-        <w:t>Daisy ElectroSmith</w:t>
-      </w:r>
-    </w:p>
-    <w:p>
-      <w:pPr>
-        <w:pStyle w:val="Normal1"/>
-        <w:rPr>
-          <w:i/>
-          <w:color w:val="000000" w:themeColor="text1"/>
-          <w:sz w:val="24"/>
-          <w:szCs w:val="24"/>
-        </w:rPr>
-      </w:pPr>
-      <w:hyperlink r:id="rId32" w:history="1">
+        <w:t xml:space="preserve">Daisy </w:t>
+      </w:r>
+      <w:proofErr w:type="spellStart"/>
+      <w:r>
+        <w:rPr>
+          <w:i/>
+          <w:color w:val="000000" w:themeColor="text1"/>
+          <w:sz w:val="24"/>
+          <w:szCs w:val="24"/>
+        </w:rPr>
+        <w:t>ElectroSmith</w:t>
+      </w:r>
+      <w:proofErr w:type="spellEnd"/>
+    </w:p>
+    <w:p>
+      <w:pPr>
+        <w:pStyle w:val="Normal1"/>
+        <w:rPr>
+          <w:i/>
+          <w:color w:val="000000" w:themeColor="text1"/>
+          <w:sz w:val="24"/>
+          <w:szCs w:val="24"/>
+        </w:rPr>
+      </w:pPr>
+      <w:hyperlink r:id="rId33" w:history="1">
         <w:r>
           <w:rPr>
             <w:rStyle w:val="Hyperlink"/>
@@ -7999,7 +9169,27 @@
           <w:sz w:val="24"/>
           <w:szCs w:val="24"/>
         </w:rPr>
-        <w:t xml:space="preserve">Exploration of Daisy Electrosmith and </w:t>
+        <w:t xml:space="preserve">Exploration of Daisy </w:t>
+      </w:r>
+      <w:proofErr w:type="spellStart"/>
+      <w:r>
+        <w:rPr>
+          <w:i/>
+          <w:color w:val="000000" w:themeColor="text1"/>
+          <w:sz w:val="24"/>
+          <w:szCs w:val="24"/>
+        </w:rPr>
+        <w:t>Electrosmith</w:t>
+      </w:r>
+      <w:proofErr w:type="spellEnd"/>
+      <w:r>
+        <w:rPr>
+          <w:i/>
+          <w:color w:val="000000" w:themeColor="text1"/>
+          <w:sz w:val="24"/>
+          <w:szCs w:val="24"/>
+        </w:rPr>
+        <w:t xml:space="preserve"> and </w:t>
       </w:r>
     </w:p>
     <w:p>
@@ -8058,7 +9248,7 @@
                     </pic:cNvPicPr>
                   </pic:nvPicPr>
                   <pic:blipFill>
-                    <a:blip r:embed="rId33">
+                    <a:blip r:embed="rId34">
                       <a:extLst>
                         <a:ext uri="{28A0092B-C50C-407E-A947-70E740481C1C}">
                           <a14:useLocalDpi xmlns:a14="http://schemas.microsoft.com/office/drawing/2010/main" val="0"/>
@@ -8114,7 +9304,7 @@
                     </pic:cNvPicPr>
                   </pic:nvPicPr>
                   <pic:blipFill>
-                    <a:blip r:embed="rId34">
+                    <a:blip r:embed="rId35">
                       <a:extLst>
                         <a:ext uri="{28A0092B-C50C-407E-A947-70E740481C1C}">
                           <a14:useLocalDpi xmlns:a14="http://schemas.microsoft.com/office/drawing/2010/main" val="0"/>
@@ -8199,14 +9389,25 @@
         </w:rPr>
         <w:t xml:space="preserve">Get some sounds working on your </w:t>
       </w:r>
-      <w:r>
-        <w:rPr>
-          <w:i/>
-          <w:color w:val="000000" w:themeColor="text1"/>
-          <w:sz w:val="24"/>
-          <w:szCs w:val="24"/>
-        </w:rPr>
-        <w:t xml:space="preserve">electrosmith </w:t>
+      <w:proofErr w:type="spellStart"/>
+      <w:r>
+        <w:rPr>
+          <w:i/>
+          <w:color w:val="000000" w:themeColor="text1"/>
+          <w:sz w:val="24"/>
+          <w:szCs w:val="24"/>
+        </w:rPr>
+        <w:t>electrosmith</w:t>
+      </w:r>
+      <w:proofErr w:type="spellEnd"/>
+      <w:r>
+        <w:rPr>
+          <w:i/>
+          <w:color w:val="000000" w:themeColor="text1"/>
+          <w:sz w:val="24"/>
+          <w:szCs w:val="24"/>
+        </w:rPr>
+        <w:t xml:space="preserve"> </w:t>
       </w:r>
       <w:r>
         <w:rPr>
@@ -8413,7 +9614,6 @@
           <w:sz w:val="24"/>
           <w:szCs w:val="24"/>
         </w:rPr>
-        <w:lastRenderedPageBreak/>
         <w:t>Class 11 Wednesday 11/</w:t>
       </w:r>
       <w:r>
@@ -8473,7 +9673,7 @@
           <w:szCs w:val="24"/>
         </w:rPr>
       </w:pPr>
-      <w:hyperlink r:id="rId35" w:history="1">
+      <w:hyperlink r:id="rId36" w:history="1">
         <w:r>
           <w:rPr>
             <w:rStyle w:val="Hyperlink"/>
@@ -8504,7 +9704,27 @@
           <w:sz w:val="24"/>
           <w:szCs w:val="24"/>
         </w:rPr>
-        <w:t>The Fluid Corpus Manipulation project (FluCoMa) instigates new musical ways of exploiting ever-growing banks of so</w:t>
+        <w:t>The Fluid Corpus Manipulation project (</w:t>
+      </w:r>
+      <w:proofErr w:type="spellStart"/>
+      <w:r>
+        <w:rPr>
+          <w:iCs/>
+          <w:color w:val="000000" w:themeColor="text1"/>
+          <w:sz w:val="24"/>
+          <w:szCs w:val="24"/>
+        </w:rPr>
+        <w:t>FluCoMa</w:t>
+      </w:r>
+      <w:proofErr w:type="spellEnd"/>
+      <w:r>
+        <w:rPr>
+          <w:iCs/>
+          <w:color w:val="000000" w:themeColor="text1"/>
+          <w:sz w:val="24"/>
+          <w:szCs w:val="24"/>
+        </w:rPr>
+        <w:t>) instigates new musical ways of exploiting ever-growing banks of so</w:t>
       </w:r>
       <w:r>
         <w:rPr>
@@ -8553,7 +9773,27 @@
           <w:sz w:val="24"/>
           <w:szCs w:val="24"/>
         </w:rPr>
-        <w:t>These potent algorithms are currently partially available in closed bespoke software, or in laboratories, but not at a suitable level of modularity within the main coding environments used by the creative researchers, namely Max, Pd and SuperCollider, to allow groundbreaking sonic research into a rich unexploited area: the manipulation of large sound corpora. Indeed, with access to, genesis of, and storage of large sound banks now commonplace, novel ways of abstracting and manipulating them are needed to mine their inherent potential.</w:t>
+        <w:t xml:space="preserve">These potent algorithms are currently partially available in closed bespoke software, or in laboratories, but not at a suitable level of modularity within the main coding environments used by the creative researchers, namely Max, Pd and </w:t>
+      </w:r>
+      <w:proofErr w:type="spellStart"/>
+      <w:r>
+        <w:rPr>
+          <w:iCs/>
+          <w:color w:val="000000" w:themeColor="text1"/>
+          <w:sz w:val="24"/>
+          <w:szCs w:val="24"/>
+        </w:rPr>
+        <w:t>SuperCollider</w:t>
+      </w:r>
+      <w:proofErr w:type="spellEnd"/>
+      <w:r>
+        <w:rPr>
+          <w:iCs/>
+          <w:color w:val="000000" w:themeColor="text1"/>
+          <w:sz w:val="24"/>
+          <w:szCs w:val="24"/>
+        </w:rPr>
+        <w:t>, to allow groundbreaking sonic research into a rich unexploited area: the manipulation of large sound corpora. Indeed, with access to, genesis of, and storage of large sound banks now commonplace, novel ways of abstracting and manipulating them are needed to mine their inherent potential.</w:t>
       </w:r>
       <w:r>
         <w:rPr>
@@ -8794,6 +10034,7 @@
           <w:sz w:val="24"/>
           <w:szCs w:val="24"/>
         </w:rPr>
+        <w:lastRenderedPageBreak/>
         <w:pict w14:anchorId="78D2CA2C">
           <v:rect id="_x0000_i1027" alt="" style="width:468pt;height:.05pt;mso-width-percent:0;mso-height-percent:0;mso-width-percent:0;mso-height-percent:0" o:hralign="center" o:hrstd="t" o:hr="t" fillcolor="#a0a0a0" stroked="f"/>
         </w:pict>
@@ -9066,12 +10307,12 @@
       </w:pPr>
     </w:p>
     <w:sectPr>
-      <w:headerReference w:type="even" r:id="rId36"/>
-      <w:headerReference w:type="default" r:id="rId37"/>
-      <w:footerReference w:type="even" r:id="rId38"/>
-      <w:footerReference w:type="default" r:id="rId39"/>
-      <w:headerReference w:type="first" r:id="rId40"/>
-      <w:footerReference w:type="first" r:id="rId41"/>
+      <w:headerReference w:type="even" r:id="rId37"/>
+      <w:headerReference w:type="default" r:id="rId38"/>
+      <w:footerReference w:type="even" r:id="rId39"/>
+      <w:footerReference w:type="default" r:id="rId40"/>
+      <w:headerReference w:type="first" r:id="rId41"/>
+      <w:footerReference w:type="first" r:id="rId42"/>
       <w:type w:val="continuous"/>
       <w:pgSz w:w="12240" w:h="15840"/>
       <w:pgMar w:top="1440" w:right="1440" w:bottom="1440" w:left="1440" w:header="720" w:footer="720" w:gutter="0"/>

</xml_diff>